<commit_message>
last commit, not doing these stuff again, chill chill
</commit_message>
<xml_diff>
--- a/ref/VuQuangPhuc.docx
+++ b/ref/VuQuangPhuc.docx
@@ -4573,7 +4573,7 @@
         </w:rPr>
         <w:fldChar w:fldCharType="separate"/>
       </w:r>
-      <w:hyperlink w:anchor="_Toc196181331" w:history="1">
+      <w:hyperlink w:anchor="_Toc199728837" w:history="1">
         <w:r>
           <w:rPr>
             <w:rStyle w:val="Hyperlink"/>
@@ -4600,7 +4600,7 @@
             <w:noProof/>
             <w:webHidden/>
           </w:rPr>
-          <w:instrText xml:space="preserve"> PAGEREF _Toc196181331 \h </w:instrText>
+          <w:instrText xml:space="preserve"> PAGEREF _Toc199728837 \h </w:instrText>
         </w:r>
         <w:r>
           <w:rPr>
@@ -4646,7 +4646,7 @@
           <w14:ligatures w14:val="standardContextual"/>
         </w:rPr>
       </w:pPr>
-      <w:hyperlink w:anchor="_Toc196181332" w:history="1">
+      <w:hyperlink w:anchor="_Toc199728838" w:history="1">
         <w:r>
           <w:rPr>
             <w:rStyle w:val="Hyperlink"/>
@@ -4673,7 +4673,7 @@
             <w:noProof/>
             <w:webHidden/>
           </w:rPr>
-          <w:instrText xml:space="preserve"> PAGEREF _Toc196181332 \h </w:instrText>
+          <w:instrText xml:space="preserve"> PAGEREF _Toc199728838 \h </w:instrText>
         </w:r>
         <w:r>
           <w:rPr>
@@ -4719,7 +4719,7 @@
           <w14:ligatures w14:val="standardContextual"/>
         </w:rPr>
       </w:pPr>
-      <w:hyperlink w:anchor="_Toc196181333" w:history="1">
+      <w:hyperlink w:anchor="_Toc199728839" w:history="1">
         <w:r>
           <w:rPr>
             <w:rStyle w:val="Hyperlink"/>
@@ -4746,7 +4746,7 @@
             <w:noProof/>
             <w:webHidden/>
           </w:rPr>
-          <w:instrText xml:space="preserve"> PAGEREF _Toc196181333 \h </w:instrText>
+          <w:instrText xml:space="preserve"> PAGEREF _Toc199728839 \h </w:instrText>
         </w:r>
         <w:r>
           <w:rPr>
@@ -4792,7 +4792,7 @@
           <w14:ligatures w14:val="standardContextual"/>
         </w:rPr>
       </w:pPr>
-      <w:hyperlink w:anchor="_Toc196181334" w:history="1">
+      <w:hyperlink w:anchor="_Toc199728840" w:history="1">
         <w:r>
           <w:rPr>
             <w:rStyle w:val="Hyperlink"/>
@@ -4819,7 +4819,7 @@
             <w:noProof/>
             <w:webHidden/>
           </w:rPr>
-          <w:instrText xml:space="preserve"> PAGEREF _Toc196181334 \h </w:instrText>
+          <w:instrText xml:space="preserve"> PAGEREF _Toc199728840 \h </w:instrText>
         </w:r>
         <w:r>
           <w:rPr>
@@ -4865,7 +4865,7 @@
           <w14:ligatures w14:val="standardContextual"/>
         </w:rPr>
       </w:pPr>
-      <w:hyperlink w:anchor="_Toc196181335" w:history="1">
+      <w:hyperlink w:anchor="_Toc199728841" w:history="1">
         <w:r>
           <w:rPr>
             <w:rStyle w:val="Hyperlink"/>
@@ -4892,7 +4892,7 @@
             <w:noProof/>
             <w:webHidden/>
           </w:rPr>
-          <w:instrText xml:space="preserve"> PAGEREF _Toc196181335 \h </w:instrText>
+          <w:instrText xml:space="preserve"> PAGEREF _Toc199728841 \h </w:instrText>
         </w:r>
         <w:r>
           <w:rPr>
@@ -4938,7 +4938,7 @@
           <w14:ligatures w14:val="standardContextual"/>
         </w:rPr>
       </w:pPr>
-      <w:hyperlink w:anchor="_Toc196181336" w:history="1">
+      <w:hyperlink w:anchor="_Toc199728842" w:history="1">
         <w:r>
           <w:rPr>
             <w:rStyle w:val="Hyperlink"/>
@@ -4965,7 +4965,7 @@
             <w:noProof/>
             <w:webHidden/>
           </w:rPr>
-          <w:instrText xml:space="preserve"> PAGEREF _Toc196181336 \h </w:instrText>
+          <w:instrText xml:space="preserve"> PAGEREF _Toc199728842 \h </w:instrText>
         </w:r>
         <w:r>
           <w:rPr>
@@ -5011,7 +5011,7 @@
           <w14:ligatures w14:val="standardContextual"/>
         </w:rPr>
       </w:pPr>
-      <w:hyperlink w:anchor="_Toc196181337" w:history="1">
+      <w:hyperlink w:anchor="_Toc199728843" w:history="1">
         <w:r>
           <w:rPr>
             <w:rStyle w:val="Hyperlink"/>
@@ -5038,7 +5038,7 @@
             <w:noProof/>
             <w:webHidden/>
           </w:rPr>
-          <w:instrText xml:space="preserve"> PAGEREF _Toc196181337 \h </w:instrText>
+          <w:instrText xml:space="preserve"> PAGEREF _Toc199728843 \h </w:instrText>
         </w:r>
         <w:r>
           <w:rPr>
@@ -5058,7 +5058,7 @@
             <w:noProof/>
             <w:webHidden/>
           </w:rPr>
-          <w:t>11</w:t>
+          <w:t>12</w:t>
         </w:r>
         <w:r>
           <w:rPr>
@@ -5084,7 +5084,80 @@
           <w14:ligatures w14:val="standardContextual"/>
         </w:rPr>
       </w:pPr>
-      <w:hyperlink w:anchor="_Toc196181338" w:history="1">
+      <w:hyperlink w:anchor="_Toc199728844" w:history="1">
+        <w:r>
+          <w:rPr>
+            <w:rStyle w:val="Hyperlink"/>
+            <w:noProof/>
+          </w:rPr>
+          <w:t>Figure 3.3 Nothing else</w:t>
+        </w:r>
+        <w:r>
+          <w:rPr>
+            <w:noProof/>
+            <w:webHidden/>
+          </w:rPr>
+          <w:tab/>
+        </w:r>
+        <w:r>
+          <w:rPr>
+            <w:noProof/>
+            <w:webHidden/>
+          </w:rPr>
+          <w:fldChar w:fldCharType="begin"/>
+        </w:r>
+        <w:r>
+          <w:rPr>
+            <w:noProof/>
+            <w:webHidden/>
+          </w:rPr>
+          <w:instrText xml:space="preserve"> PAGEREF _Toc199728844 \h </w:instrText>
+        </w:r>
+        <w:r>
+          <w:rPr>
+            <w:noProof/>
+            <w:webHidden/>
+          </w:rPr>
+        </w:r>
+        <w:r>
+          <w:rPr>
+            <w:noProof/>
+            <w:webHidden/>
+          </w:rPr>
+          <w:fldChar w:fldCharType="separate"/>
+        </w:r>
+        <w:r>
+          <w:rPr>
+            <w:noProof/>
+            <w:webHidden/>
+          </w:rPr>
+          <w:t>12</w:t>
+        </w:r>
+        <w:r>
+          <w:rPr>
+            <w:noProof/>
+            <w:webHidden/>
+          </w:rPr>
+          <w:fldChar w:fldCharType="end"/>
+        </w:r>
+      </w:hyperlink>
+    </w:p>
+    <w:p>
+      <w:pPr>
+        <w:pStyle w:val="TableofFigures"/>
+        <w:tabs>
+          <w:tab w:val="right" w:leader="dot" w:pos="9056"/>
+        </w:tabs>
+        <w:rPr>
+          <w:rFonts w:asciiTheme="minorHAnsi" w:eastAsiaTheme="minorEastAsia" w:hAnsiTheme="minorHAnsi" w:cstheme="minorBidi"/>
+          <w:noProof/>
+          <w:kern w:val="2"/>
+          <w:sz w:val="24"/>
+          <w:szCs w:val="24"/>
+          <w14:ligatures w14:val="standardContextual"/>
+        </w:rPr>
+      </w:pPr>
+      <w:hyperlink w:anchor="_Toc199728845" w:history="1">
         <w:r>
           <w:rPr>
             <w:rStyle w:val="Hyperlink"/>
@@ -5111,7 +5184,7 @@
             <w:noProof/>
             <w:webHidden/>
           </w:rPr>
-          <w:instrText xml:space="preserve"> PAGEREF _Toc196181338 \h </w:instrText>
+          <w:instrText xml:space="preserve"> PAGEREF _Toc199728845 \h </w:instrText>
         </w:r>
         <w:r>
           <w:rPr>
@@ -5131,7 +5204,7 @@
             <w:noProof/>
             <w:webHidden/>
           </w:rPr>
-          <w:t>13</w:t>
+          <w:t>14</w:t>
         </w:r>
         <w:r>
           <w:rPr>
@@ -5157,7 +5230,7 @@
           <w14:ligatures w14:val="standardContextual"/>
         </w:rPr>
       </w:pPr>
-      <w:hyperlink w:anchor="_Toc196181339" w:history="1">
+      <w:hyperlink w:anchor="_Toc199728846" w:history="1">
         <w:r>
           <w:rPr>
             <w:rStyle w:val="Hyperlink"/>
@@ -5184,153 +5257,7 @@
             <w:noProof/>
             <w:webHidden/>
           </w:rPr>
-          <w:instrText xml:space="preserve"> PAGEREF _Toc196181339 \h </w:instrText>
-        </w:r>
-        <w:r>
-          <w:rPr>
-            <w:noProof/>
-            <w:webHidden/>
-          </w:rPr>
-        </w:r>
-        <w:r>
-          <w:rPr>
-            <w:noProof/>
-            <w:webHidden/>
-          </w:rPr>
-          <w:fldChar w:fldCharType="separate"/>
-        </w:r>
-        <w:r>
-          <w:rPr>
-            <w:noProof/>
-            <w:webHidden/>
-          </w:rPr>
-          <w:t>13</w:t>
-        </w:r>
-        <w:r>
-          <w:rPr>
-            <w:noProof/>
-            <w:webHidden/>
-          </w:rPr>
-          <w:fldChar w:fldCharType="end"/>
-        </w:r>
-      </w:hyperlink>
-    </w:p>
-    <w:p>
-      <w:pPr>
-        <w:pStyle w:val="TableofFigures"/>
-        <w:tabs>
-          <w:tab w:val="right" w:leader="dot" w:pos="9056"/>
-        </w:tabs>
-        <w:rPr>
-          <w:rFonts w:asciiTheme="minorHAnsi" w:eastAsiaTheme="minorEastAsia" w:hAnsiTheme="minorHAnsi" w:cstheme="minorBidi"/>
-          <w:noProof/>
-          <w:kern w:val="2"/>
-          <w:sz w:val="24"/>
-          <w:szCs w:val="24"/>
-          <w14:ligatures w14:val="standardContextual"/>
-        </w:rPr>
-      </w:pPr>
-      <w:hyperlink w:anchor="_Toc196181340" w:history="1">
-        <w:r>
-          <w:rPr>
-            <w:rStyle w:val="Hyperlink"/>
-            <w:noProof/>
-          </w:rPr>
-          <w:t>Figure 4.3</w:t>
-        </w:r>
-        <w:r>
-          <w:rPr>
-            <w:noProof/>
-            <w:webHidden/>
-          </w:rPr>
-          <w:tab/>
-        </w:r>
-        <w:r>
-          <w:rPr>
-            <w:noProof/>
-            <w:webHidden/>
-          </w:rPr>
-          <w:fldChar w:fldCharType="begin"/>
-        </w:r>
-        <w:r>
-          <w:rPr>
-            <w:noProof/>
-            <w:webHidden/>
-          </w:rPr>
-          <w:instrText xml:space="preserve"> PAGEREF _Toc196181340 \h </w:instrText>
-        </w:r>
-        <w:r>
-          <w:rPr>
-            <w:noProof/>
-            <w:webHidden/>
-          </w:rPr>
-        </w:r>
-        <w:r>
-          <w:rPr>
-            <w:noProof/>
-            <w:webHidden/>
-          </w:rPr>
-          <w:fldChar w:fldCharType="separate"/>
-        </w:r>
-        <w:r>
-          <w:rPr>
-            <w:noProof/>
-            <w:webHidden/>
-          </w:rPr>
-          <w:t>13</w:t>
-        </w:r>
-        <w:r>
-          <w:rPr>
-            <w:noProof/>
-            <w:webHidden/>
-          </w:rPr>
-          <w:fldChar w:fldCharType="end"/>
-        </w:r>
-      </w:hyperlink>
-    </w:p>
-    <w:p>
-      <w:pPr>
-        <w:pStyle w:val="TableofFigures"/>
-        <w:tabs>
-          <w:tab w:val="right" w:leader="dot" w:pos="9056"/>
-        </w:tabs>
-        <w:rPr>
-          <w:rFonts w:asciiTheme="minorHAnsi" w:eastAsiaTheme="minorEastAsia" w:hAnsiTheme="minorHAnsi" w:cstheme="minorBidi"/>
-          <w:noProof/>
-          <w:kern w:val="2"/>
-          <w:sz w:val="24"/>
-          <w:szCs w:val="24"/>
-          <w14:ligatures w14:val="standardContextual"/>
-        </w:rPr>
-      </w:pPr>
-      <w:hyperlink w:anchor="_Toc196181341" w:history="1">
-        <w:r>
-          <w:rPr>
-            <w:rStyle w:val="Hyperlink"/>
-            <w:noProof/>
-          </w:rPr>
-          <w:t>Figure 4.4</w:t>
-        </w:r>
-        <w:r>
-          <w:rPr>
-            <w:noProof/>
-            <w:webHidden/>
-          </w:rPr>
-          <w:tab/>
-        </w:r>
-        <w:r>
-          <w:rPr>
-            <w:noProof/>
-            <w:webHidden/>
-          </w:rPr>
-          <w:fldChar w:fldCharType="begin"/>
-        </w:r>
-        <w:r>
-          <w:rPr>
-            <w:noProof/>
-            <w:webHidden/>
-          </w:rPr>
-          <w:instrText xml:space="preserve"> PAGEREF _Toc196181341 \h </w:instrText>
+          <w:instrText xml:space="preserve"> PAGEREF _Toc199728846 \h </w:instrText>
         </w:r>
         <w:r>
           <w:rPr>
@@ -5614,7 +5541,7 @@
       <w:pPr>
         <w:pStyle w:val="Caption"/>
       </w:pPr>
-      <w:bookmarkStart w:id="11" w:name="_Toc196181331"/>
+      <w:bookmarkStart w:id="11" w:name="_Toc199728837"/>
       <w:r>
         <w:t xml:space="preserve">Figure </w:t>
       </w:r>
@@ -5636,8 +5563,8 @@
           </w:rPr>
           <w:t>1</w:t>
         </w:r>
+        <w:bookmarkEnd w:id="11"/>
       </w:fldSimple>
-      <w:bookmarkEnd w:id="11"/>
     </w:p>
     <w:p>
       <w:pPr>
@@ -5692,7 +5619,7 @@
       <w:pPr>
         <w:pStyle w:val="Caption"/>
       </w:pPr>
-      <w:bookmarkStart w:id="12" w:name="_Toc196181332"/>
+      <w:bookmarkStart w:id="12" w:name="_Toc199728838"/>
       <w:r>
         <w:t xml:space="preserve">Figure </w:t>
       </w:r>
@@ -5714,14 +5641,14 @@
           </w:rPr>
           <w:t>2</w:t>
         </w:r>
+        <w:bookmarkEnd w:id="12"/>
       </w:fldSimple>
-      <w:bookmarkEnd w:id="12"/>
     </w:p>
     <w:p>
       <w:pPr>
         <w:pStyle w:val="Caption"/>
       </w:pPr>
-      <w:bookmarkStart w:id="13" w:name="_Toc196181333"/>
+      <w:bookmarkStart w:id="13" w:name="_Toc199728839"/>
       <w:r>
         <w:t xml:space="preserve">Figure </w:t>
       </w:r>
@@ -5743,14 +5670,14 @@
           </w:rPr>
           <w:t>3</w:t>
         </w:r>
+        <w:bookmarkEnd w:id="13"/>
       </w:fldSimple>
-      <w:bookmarkEnd w:id="13"/>
     </w:p>
     <w:p>
       <w:pPr>
         <w:pStyle w:val="Caption"/>
       </w:pPr>
-      <w:bookmarkStart w:id="14" w:name="_Toc196181334"/>
+      <w:bookmarkStart w:id="14" w:name="_Toc199728840"/>
       <w:r>
         <w:t xml:space="preserve">Figure </w:t>
       </w:r>
@@ -5772,8 +5699,8 @@
           </w:rPr>
           <w:t>4</w:t>
         </w:r>
+        <w:bookmarkEnd w:id="14"/>
       </w:fldSimple>
-      <w:bookmarkEnd w:id="14"/>
     </w:p>
     <w:p>
       <w:pPr>
@@ -5990,7 +5917,7 @@
           <w:lang w:val="vi-VN"/>
         </w:rPr>
       </w:pPr>
-      <w:bookmarkStart w:id="20" w:name="_Toc196181335"/>
+      <w:bookmarkStart w:id="20" w:name="_Toc199728841"/>
       <w:r>
         <w:t xml:space="preserve">Figure </w:t>
       </w:r>
@@ -6012,8 +5939,8 @@
           </w:rPr>
           <w:t>1</w:t>
         </w:r>
+        <w:bookmarkEnd w:id="20"/>
       </w:fldSimple>
-      <w:bookmarkEnd w:id="20"/>
     </w:p>
     <w:p>
       <w:pPr>
@@ -6272,7 +6199,7 @@
       <w:pPr>
         <w:pStyle w:val="Caption"/>
       </w:pPr>
-      <w:bookmarkStart w:id="31" w:name="_Toc196181336"/>
+      <w:bookmarkStart w:id="31" w:name="_Toc199728842"/>
       <w:r>
         <w:t xml:space="preserve">Figure </w:t>
       </w:r>
@@ -6294,8 +6221,8 @@
           </w:rPr>
           <w:t>1</w:t>
         </w:r>
+        <w:bookmarkEnd w:id="31"/>
       </w:fldSimple>
-      <w:bookmarkEnd w:id="31"/>
     </w:p>
     <w:p>
       <w:pPr>
@@ -6519,6 +6446,7 @@
       <w:pPr>
         <w:pStyle w:val="Caption"/>
       </w:pPr>
+      <w:bookmarkStart w:id="32" w:name="_Toc199728843"/>
       <w:r>
         <w:t xml:space="preserve">Figure </w:t>
       </w:r>
@@ -6540,6 +6468,7 @@
           </w:rPr>
           <w:t>2</w:t>
         </w:r>
+        <w:bookmarkEnd w:id="32"/>
       </w:fldSimple>
     </w:p>
     <w:p>
@@ -6556,6 +6485,96 @@
           <w:bCs/>
         </w:rPr>
         <w:t>Data Management</w:t>
+      </w:r>
+    </w:p>
+    <w:p>
+      <w:pPr>
+        <w:keepNext/>
+        <w:spacing w:line="240" w:lineRule="auto"/>
+      </w:pPr>
+      <w:r>
+        <w:rPr>
+          <w:noProof/>
+        </w:rPr>
+        <w:drawing>
+          <wp:inline distT="0" distB="0" distL="0" distR="0" wp14:anchorId="73B4B8DF" wp14:editId="77254349">
+            <wp:extent cx="2764971" cy="2637155"/>
+            <wp:effectExtent l="0" t="0" r="0" b="0"/>
+            <wp:docPr id="1657479266" name="Picture 1"/>
+            <wp:cNvGraphicFramePr>
+              <a:graphicFrameLocks xmlns:a="http://schemas.openxmlformats.org/drawingml/2006/main" noChangeAspect="1"/>
+            </wp:cNvGraphicFramePr>
+            <a:graphic xmlns:a="http://schemas.openxmlformats.org/drawingml/2006/main">
+              <a:graphicData uri="http://schemas.openxmlformats.org/drawingml/2006/picture">
+                <pic:pic xmlns:pic="http://schemas.openxmlformats.org/drawingml/2006/picture">
+                  <pic:nvPicPr>
+                    <pic:cNvPr id="1837016067" name="Picture 1"/>
+                    <pic:cNvPicPr>
+                      <a:picLocks noChangeAspect="1"/>
+                    </pic:cNvPicPr>
+                  </pic:nvPicPr>
+                  <pic:blipFill>
+                    <a:blip r:embed="rId16"/>
+                    <a:stretch>
+                      <a:fillRect/>
+                    </a:stretch>
+                  </pic:blipFill>
+                  <pic:spPr>
+                    <a:xfrm>
+                      <a:off x="0" y="0"/>
+                      <a:ext cx="2768973" cy="2640972"/>
+                    </a:xfrm>
+                    <a:prstGeom prst="rect">
+                      <a:avLst/>
+                    </a:prstGeom>
+                  </pic:spPr>
+                </pic:pic>
+              </a:graphicData>
+            </a:graphic>
+          </wp:inline>
+        </w:drawing>
+      </w:r>
+    </w:p>
+    <w:p>
+      <w:pPr>
+        <w:pStyle w:val="Caption"/>
+        <w:jc w:val="left"/>
+      </w:pPr>
+      <w:bookmarkStart w:id="33" w:name="_Toc199728844"/>
+      <w:r>
+        <w:t xml:space="preserve">Figure </w:t>
+      </w:r>
+      <w:fldSimple w:instr=" STYLEREF 1 \s ">
+        <w:r>
+          <w:rPr>
+            <w:noProof/>
+          </w:rPr>
+          <w:t>3</w:t>
+        </w:r>
+      </w:fldSimple>
+      <w:r>
+        <w:t>.</w:t>
+      </w:r>
+      <w:fldSimple w:instr=" SEQ Figure \* ARABIC \s 1 ">
+        <w:r>
+          <w:rPr>
+            <w:noProof/>
+          </w:rPr>
+          <w:t>3</w:t>
+        </w:r>
+      </w:fldSimple>
+      <w:r>
+        <w:t xml:space="preserve"> Nothing else</w:t>
+      </w:r>
+      <w:bookmarkEnd w:id="33"/>
+    </w:p>
+    <w:p>
+      <w:pPr>
+        <w:spacing w:line="240" w:lineRule="auto"/>
+      </w:pPr>
+      <w:r>
+        <w:lastRenderedPageBreak/>
+        <w:br w:type="page"/>
       </w:r>
     </w:p>
     <w:p>
@@ -6568,9 +6587,6 @@
           <w:szCs w:val="32"/>
         </w:rPr>
       </w:pPr>
-      <w:r>
-        <w:br w:type="page"/>
-      </w:r>
     </w:p>
     <w:p>
       <w:pPr>
@@ -6579,12 +6595,11 @@
           <w:lang w:val="vi-VN"/>
         </w:rPr>
       </w:pPr>
-      <w:bookmarkStart w:id="32" w:name="_Toc196182005"/>
-      <w:r>
-        <w:lastRenderedPageBreak/>
+      <w:bookmarkStart w:id="34" w:name="_Toc196182005"/>
+      <w:r>
         <w:t>WEBSITE IMPLEMENTATION</w:t>
       </w:r>
-      <w:bookmarkEnd w:id="32"/>
+      <w:bookmarkEnd w:id="34"/>
     </w:p>
     <w:p>
       <w:pPr>
@@ -6605,9 +6620,9 @@
           <w:szCs w:val="26"/>
         </w:rPr>
       </w:pPr>
-      <w:bookmarkStart w:id="33" w:name="_Toc76717688"/>
-      <w:bookmarkStart w:id="34" w:name="_Toc196182006"/>
-      <w:bookmarkEnd w:id="34"/>
+      <w:bookmarkStart w:id="35" w:name="_Toc196182006"/>
+      <w:bookmarkStart w:id="36" w:name="_Toc76717688"/>
+      <w:bookmarkEnd w:id="35"/>
     </w:p>
     <w:p>
       <w:pPr>
@@ -6617,12 +6632,12 @@
           <w:numId w:val="72"/>
         </w:numPr>
       </w:pPr>
-      <w:bookmarkStart w:id="35" w:name="_Toc196182007"/>
+      <w:bookmarkStart w:id="37" w:name="_Toc196182007"/>
       <w:proofErr w:type="spellStart"/>
       <w:r>
         <w:t>Problemfdfdfd</w:t>
       </w:r>
-      <w:bookmarkEnd w:id="35"/>
+      <w:bookmarkEnd w:id="37"/>
       <w:proofErr w:type="spellEnd"/>
     </w:p>
     <w:p>
@@ -6679,7 +6694,7 @@
       <w:pPr>
         <w:pStyle w:val="Caption"/>
       </w:pPr>
-      <w:bookmarkStart w:id="36" w:name="_Toc196181338"/>
+      <w:bookmarkStart w:id="38" w:name="_Toc199728845"/>
       <w:r>
         <w:t xml:space="preserve">Figure </w:t>
       </w:r>
@@ -6701,8 +6716,8 @@
           </w:rPr>
           <w:t>1</w:t>
         </w:r>
+        <w:bookmarkEnd w:id="38"/>
       </w:fldSimple>
-      <w:bookmarkEnd w:id="33"/>
       <w:bookmarkEnd w:id="36"/>
     </w:p>
     <w:p/>
@@ -6711,7 +6726,7 @@
         <w:pStyle w:val="Caption"/>
         <w:keepNext/>
       </w:pPr>
-      <w:bookmarkStart w:id="37" w:name="_Toc196181312"/>
+      <w:bookmarkStart w:id="39" w:name="_Toc196181312"/>
       <w:r>
         <w:t xml:space="preserve">Table </w:t>
       </w:r>
@@ -6734,7 +6749,7 @@
           <w:t>1</w:t>
         </w:r>
       </w:fldSimple>
-      <w:bookmarkEnd w:id="37"/>
+      <w:bookmarkEnd w:id="39"/>
     </w:p>
     <w:tbl>
       <w:tblPr>
@@ -6900,6 +6915,7 @@
         <w:pStyle w:val="Caption"/>
         <w:jc w:val="both"/>
       </w:pPr>
+      <w:bookmarkStart w:id="40" w:name="_Toc199728846"/>
       <w:r>
         <w:t xml:space="preserve">Figure </w:t>
       </w:r>
@@ -6921,6 +6937,7 @@
           </w:rPr>
           <w:t>2</w:t>
         </w:r>
+        <w:bookmarkEnd w:id="40"/>
       </w:fldSimple>
     </w:p>
     <w:p/>
@@ -7069,12 +7086,12 @@
         <w:spacing w:after="240"/>
         <w:jc w:val="center"/>
       </w:pPr>
-      <w:bookmarkStart w:id="38" w:name="_Toc196182008"/>
+      <w:bookmarkStart w:id="41" w:name="_Toc196182008"/>
       <w:r>
         <w:lastRenderedPageBreak/>
         <w:t>CONCLUSION</w:t>
       </w:r>
-      <w:bookmarkEnd w:id="38"/>
+      <w:bookmarkEnd w:id="41"/>
     </w:p>
     <w:p>
       <w:pPr>
@@ -7210,12 +7227,12 @@
         <w:spacing w:after="240"/>
         <w:jc w:val="center"/>
       </w:pPr>
-      <w:bookmarkStart w:id="39" w:name="_Toc196182009"/>
+      <w:bookmarkStart w:id="42" w:name="_Toc196182009"/>
       <w:r>
         <w:lastRenderedPageBreak/>
         <w:t>REFERENCES</w:t>
       </w:r>
-      <w:bookmarkEnd w:id="39"/>
+      <w:bookmarkEnd w:id="42"/>
     </w:p>
     <w:tbl>
       <w:tblPr>
@@ -17398,19 +17415,6 @@
 </file>
 
 <file path=customXml/item1.xml><?xml version="1.0" encoding="utf-8"?>
-<s:customData xmlns="http://www.wps.cn/officeDocument/2013/wpsCustomData" xmlns:s="http://www.wps.cn/officeDocument/2013/wpsCustomData">
-  <customSectProps>
-    <customSectPr/>
-    <customSectPr/>
-    <customSectPr/>
-  </customSectProps>
-  <customShpExts>
-    <customShpInfo spid="_x0000_s1026" textRotate="1"/>
-  </customShpExts>
-</s:customData>
-</file>
-
-<file path=customXml/item2.xml><?xml version="1.0" encoding="utf-8"?>
 <b:Sources xmlns:b="http://schemas.openxmlformats.org/officeDocument/2006/bibliography" xmlns="http://schemas.openxmlformats.org/officeDocument/2006/bibliography" SelectedStyle="/IEEE2006OfficeOnline.xsl" StyleName="IEEE" Version="2006">
   <b:Source>
     <b:Tag>Kho12</b:Tag>
@@ -17512,18 +17516,31 @@
 </b:Sources>
 </file>
 
+<file path=customXml/item2.xml><?xml version="1.0" encoding="utf-8"?>
+<s:customData xmlns="http://www.wps.cn/officeDocument/2013/wpsCustomData" xmlns:s="http://www.wps.cn/officeDocument/2013/wpsCustomData">
+  <customSectProps>
+    <customSectPr/>
+    <customSectPr/>
+    <customSectPr/>
+  </customSectProps>
+  <customShpExts>
+    <customShpInfo spid="_x0000_s1026" textRotate="1"/>
+  </customShpExts>
+</s:customData>
+</file>
+
 <file path=customXml/itemProps1.xml><?xml version="1.0" encoding="utf-8"?>
+<ds:datastoreItem xmlns:ds="http://schemas.openxmlformats.org/officeDocument/2006/customXml" ds:itemID="{56C03FB1-854A-4A78-823E-3CE54C9704D1}">
+  <ds:schemaRefs>
+    <ds:schemaRef ds:uri="http://schemas.openxmlformats.org/officeDocument/2006/bibliography"/>
+  </ds:schemaRefs>
+</ds:datastoreItem>
+</file>
+
+<file path=customXml/itemProps2.xml><?xml version="1.0" encoding="utf-8"?>
 <ds:datastoreItem xmlns:ds="http://schemas.openxmlformats.org/officeDocument/2006/customXml" ds:itemID="{B1977F7D-205B-4081-913C-38D41E755F92}">
   <ds:schemaRefs>
     <ds:schemaRef ds:uri="http://www.wps.cn/officeDocument/2013/wpsCustomData"/>
   </ds:schemaRefs>
 </ds:datastoreItem>
-</file>
-
-<file path=customXml/itemProps2.xml><?xml version="1.0" encoding="utf-8"?>
-<ds:datastoreItem xmlns:ds="http://schemas.openxmlformats.org/officeDocument/2006/customXml" ds:itemID="{56C03FB1-854A-4A78-823E-3CE54C9704D1}">
-  <ds:schemaRefs>
-    <ds:schemaRef ds:uri="http://schemas.openxmlformats.org/officeDocument/2006/bibliography"/>
-  </ds:schemaRefs>
-</ds:datastoreItem>
 </file>
</xml_diff>